<commit_message>
Fixed multiple comparisons, cleaning repo, etc
</commit_message>
<xml_diff>
--- a/results/Aim1/tables/s_table2_multivar_assoc.docx
+++ b/results/Aim1/tables/s_table2_multivar_assoc.docx
@@ -507,7 +507,6 @@
               <w:start w:val="single" w:space="0" w:color="D3D3D3"/>
               <w:end w:val="single" w:space="0" w:color="D3D3D3"/>
             </w:tcBorders>
-            <w:shd w:val="clear" w:color="auto" w:fill="E8F4E8"/>
           </w:tcPr>
           <w:p>
             <w:pPr>
@@ -532,20 +531,19 @@
               <w:start w:val="single" w:space="0" w:color="D3D3D3"/>
               <w:end w:val="single" w:space="0" w:color="D3D3D3"/>
             </w:tcBorders>
-            <w:shd w:val="clear" w:color="auto" w:fill="C8E6C9"/>
-          </w:tcPr>
-          <w:p>
-            <w:pPr>
-              <w:spacing w:before="0" w:after="60"/>
-              <w:keepNext/>
-              <w:jc w:val="center"/>
-            </w:pPr>
-            <w:r>
-              <w:rPr>
-                <w:rFonts w:ascii="Calibri" w:hAnsi="Calibri"/>
-                <w:sz w:val="20"/>
-              </w:rPr>
-              <w:t xml:space="default">0.009</w:t>
+          </w:tcPr>
+          <w:p>
+            <w:pPr>
+              <w:spacing w:before="0" w:after="60"/>
+              <w:keepNext/>
+              <w:jc w:val="center"/>
+            </w:pPr>
+            <w:r>
+              <w:rPr>
+                <w:rFonts w:ascii="Calibri" w:hAnsi="Calibri"/>
+                <w:sz w:val="20"/>
+              </w:rPr>
+              <w:t xml:space="default">0.008 **</w:t>
             </w:r>
           </w:p>
         </w:tc>
@@ -605,7 +603,6 @@
               <w:start w:val="single" w:space="0" w:color="D3D3D3"/>
               <w:end w:val="single" w:space="0" w:color="D3D3D3"/>
             </w:tcBorders>
-            <w:shd w:val="clear" w:color="auto" w:fill="E8F4E8"/>
           </w:tcPr>
           <w:p>
             <w:pPr>
@@ -630,20 +627,19 @@
               <w:start w:val="single" w:space="0" w:color="D3D3D3"/>
               <w:end w:val="single" w:space="0" w:color="D3D3D3"/>
             </w:tcBorders>
-            <w:shd w:val="clear" w:color="auto" w:fill="C8E6C9"/>
-          </w:tcPr>
-          <w:p>
-            <w:pPr>
-              <w:spacing w:before="0" w:after="60"/>
-              <w:keepNext/>
-              <w:jc w:val="center"/>
-            </w:pPr>
-            <w:r>
-              <w:rPr>
-                <w:rFonts w:ascii="Calibri" w:hAnsi="Calibri"/>
-                <w:sz w:val="20"/>
-              </w:rPr>
-              <w:t xml:space="default">0.009</w:t>
+          </w:tcPr>
+          <w:p>
+            <w:pPr>
+              <w:spacing w:before="0" w:after="60"/>
+              <w:keepNext/>
+              <w:jc w:val="center"/>
+            </w:pPr>
+            <w:r>
+              <w:rPr>
+                <w:rFonts w:ascii="Calibri" w:hAnsi="Calibri"/>
+                <w:sz w:val="20"/>
+              </w:rPr>
+              <w:t xml:space="default">0.008 **</w:t>
             </w:r>
           </w:p>
         </w:tc>
@@ -768,7 +764,7 @@
                 <w:rFonts w:ascii="Calibri" w:hAnsi="Calibri"/>
                 <w:sz w:val="20"/>
               </w:rPr>
-              <w:t xml:space="default">0.972</w:t>
+              <w:t xml:space="default">0.957</w:t>
             </w:r>
           </w:p>
         </w:tc>
@@ -864,7 +860,7 @@
                 <w:rFonts w:ascii="Calibri" w:hAnsi="Calibri"/>
                 <w:sz w:val="20"/>
               </w:rPr>
-              <w:t xml:space="default">0.967</w:t>
+              <w:t xml:space="default">0.957</w:t>
             </w:r>
           </w:p>
         </w:tc>
@@ -989,7 +985,7 @@
                 <w:rFonts w:ascii="Calibri" w:hAnsi="Calibri"/>
                 <w:sz w:val="20"/>
               </w:rPr>
-              <w:t xml:space="default">0.640</w:t>
+              <w:t xml:space="default">0.998</w:t>
             </w:r>
           </w:p>
         </w:tc>
@@ -1085,7 +1081,7 @@
                 <w:rFonts w:ascii="Calibri" w:hAnsi="Calibri"/>
                 <w:sz w:val="20"/>
               </w:rPr>
-              <w:t xml:space="default">0.549</w:t>
+              <w:t xml:space="default">0.998</w:t>
             </w:r>
           </w:p>
         </w:tc>
@@ -1210,7 +1206,7 @@
                 <w:rFonts w:ascii="Calibri" w:hAnsi="Calibri"/>
                 <w:sz w:val="20"/>
               </w:rPr>
-              <w:t xml:space="default">0.208</w:t>
+              <w:t xml:space="default">0.854</w:t>
             </w:r>
           </w:p>
         </w:tc>
@@ -1306,7 +1302,7 @@
                 <w:rFonts w:ascii="Calibri" w:hAnsi="Calibri"/>
                 <w:sz w:val="20"/>
               </w:rPr>
-              <w:t xml:space="default">0.310</w:t>
+              <w:t xml:space="default">0.854</w:t>
             </w:r>
           </w:p>
         </w:tc>
@@ -1775,7 +1771,7 @@
                 <w:rFonts w:ascii="Calibri" w:hAnsi="Calibri"/>
                 <w:sz w:val="20"/>
               </w:rPr>
-              <w:t xml:space="default">0.228</w:t>
+              <w:t xml:space="default">—</w:t>
             </w:r>
           </w:p>
         </w:tc>
@@ -1996,7 +1992,7 @@
                 <w:rFonts w:ascii="Calibri" w:hAnsi="Calibri"/>
                 <w:sz w:val="20"/>
               </w:rPr>
-              <w:t xml:space="default">0.282</w:t>
+              <w:t xml:space="default">—</w:t>
             </w:r>
           </w:p>
         </w:tc>
@@ -2181,7 +2177,6 @@
               <w:start w:val="single" w:space="0" w:color="D3D3D3"/>
               <w:end w:val="single" w:space="0" w:color="D3D3D3"/>
             </w:tcBorders>
-            <w:shd w:val="clear" w:color="auto" w:fill="E8F4E8"/>
           </w:tcPr>
           <w:p>
             <w:pPr>
@@ -2206,20 +2201,19 @@
               <w:start w:val="single" w:space="0" w:color="D3D3D3"/>
               <w:end w:val="single" w:space="0" w:color="D3D3D3"/>
             </w:tcBorders>
-            <w:shd w:val="clear" w:color="auto" w:fill="C8E6C9"/>
-          </w:tcPr>
-          <w:p>
-            <w:pPr>
-              <w:spacing w:before="0" w:after="60"/>
-              <w:keepNext/>
-              <w:jc w:val="center"/>
-            </w:pPr>
-            <w:r>
-              <w:rPr>
-                <w:rFonts w:ascii="Calibri" w:hAnsi="Calibri"/>
-                <w:sz w:val="20"/>
-              </w:rPr>
-              <w:t xml:space="default">0.048</w:t>
+          </w:tcPr>
+          <w:p>
+            <w:pPr>
+              <w:spacing w:before="0" w:after="60"/>
+              <w:keepNext/>
+              <w:jc w:val="center"/>
+            </w:pPr>
+            <w:r>
+              <w:rPr>
+                <w:rFonts w:ascii="Calibri" w:hAnsi="Calibri"/>
+                <w:sz w:val="20"/>
+              </w:rPr>
+              <w:t xml:space="default">—</w:t>
             </w:r>
           </w:p>
         </w:tc>
@@ -2342,7 +2336,6 @@
               <w:start w:val="single" w:space="0" w:color="D3D3D3"/>
               <w:end w:val="single" w:space="0" w:color="D3D3D3"/>
             </w:tcBorders>
-            <w:shd w:val="clear" w:color="auto" w:fill="E8F4E8"/>
           </w:tcPr>
           <w:p>
             <w:pPr>
@@ -2379,7 +2372,7 @@
                 <w:rFonts w:ascii="Calibri" w:hAnsi="Calibri"/>
                 <w:sz w:val="20"/>
               </w:rPr>
-              <w:t xml:space="default">0.113</w:t>
+              <w:t xml:space="default">0.118</w:t>
             </w:r>
           </w:p>
         </w:tc>
@@ -2439,7 +2432,6 @@
               <w:start w:val="single" w:space="0" w:color="D3D3D3"/>
               <w:end w:val="single" w:space="0" w:color="D3D3D3"/>
             </w:tcBorders>
-            <w:shd w:val="clear" w:color="auto" w:fill="E8F4E8"/>
           </w:tcPr>
           <w:p>
             <w:pPr>
@@ -2464,20 +2456,19 @@
               <w:start w:val="single" w:space="0" w:color="D3D3D3"/>
               <w:end w:val="single" w:space="0" w:color="D3D3D3"/>
             </w:tcBorders>
-            <w:shd w:val="clear" w:color="auto" w:fill="C8E6C9"/>
-          </w:tcPr>
-          <w:p>
-            <w:pPr>
-              <w:spacing w:before="0" w:after="60"/>
-              <w:keepNext/>
-              <w:jc w:val="center"/>
-            </w:pPr>
-            <w:r>
-              <w:rPr>
-                <w:rFonts w:ascii="Calibri" w:hAnsi="Calibri"/>
-                <w:sz w:val="20"/>
-              </w:rPr>
-              <w:t xml:space="default">0.006</w:t>
+          </w:tcPr>
+          <w:p>
+            <w:pPr>
+              <w:spacing w:before="0" w:after="60"/>
+              <w:keepNext/>
+              <w:jc w:val="center"/>
+            </w:pPr>
+            <w:r>
+              <w:rPr>
+                <w:rFonts w:ascii="Calibri" w:hAnsi="Calibri"/>
+                <w:sz w:val="20"/>
+              </w:rPr>
+              <w:t xml:space="default">0.007 **</w:t>
             </w:r>
           </w:p>
         </w:tc>
@@ -2566,7 +2557,6 @@
               <w:start w:val="single" w:space="0" w:color="D3D3D3"/>
               <w:end w:val="single" w:space="0" w:color="D3D3D3"/>
             </w:tcBorders>
-            <w:shd w:val="clear" w:color="auto" w:fill="E8F4E8"/>
           </w:tcPr>
           <w:p>
             <w:pPr>
@@ -2603,7 +2593,7 @@
                 <w:rFonts w:ascii="Calibri" w:hAnsi="Calibri"/>
                 <w:sz w:val="20"/>
               </w:rPr>
-              <w:t xml:space="default">0.102</w:t>
+              <w:t xml:space="default">0.348</w:t>
             </w:r>
           </w:p>
         </w:tc>
@@ -2663,7 +2653,6 @@
               <w:start w:val="single" w:space="0" w:color="D3D3D3"/>
               <w:end w:val="single" w:space="0" w:color="D3D3D3"/>
             </w:tcBorders>
-            <w:shd w:val="clear" w:color="auto" w:fill="E8F4E8"/>
           </w:tcPr>
           <w:p>
             <w:pPr>
@@ -2700,7 +2689,7 @@
                 <w:rFonts w:ascii="Calibri" w:hAnsi="Calibri"/>
                 <w:sz w:val="20"/>
               </w:rPr>
-              <w:t xml:space="default">0.076</w:t>
+              <w:t xml:space="default">0.277</w:t>
             </w:r>
           </w:p>
         </w:tc>
@@ -2789,7 +2778,6 @@
               <w:start w:val="single" w:space="0" w:color="D3D3D3"/>
               <w:end w:val="single" w:space="0" w:color="D3D3D3"/>
             </w:tcBorders>
-            <w:shd w:val="clear" w:color="auto" w:fill="E8F4E8"/>
           </w:tcPr>
           <w:p>
             <w:pPr>
@@ -2826,7 +2814,7 @@
                 <w:rFonts w:ascii="Calibri" w:hAnsi="Calibri"/>
                 <w:sz w:val="20"/>
               </w:rPr>
-              <w:t xml:space="default">0.056</w:t>
+              <w:t xml:space="default">0.161</w:t>
             </w:r>
           </w:p>
         </w:tc>
@@ -2922,7 +2910,7 @@
                 <w:rFonts w:ascii="Calibri" w:hAnsi="Calibri"/>
                 <w:sz w:val="20"/>
               </w:rPr>
-              <w:t xml:space="default">0.714</w:t>
+              <w:t xml:space="default">0.998</w:t>
             </w:r>
           </w:p>
         </w:tc>
@@ -3047,7 +3035,7 @@
                 <w:rFonts w:ascii="Calibri" w:hAnsi="Calibri"/>
                 <w:sz w:val="20"/>
               </w:rPr>
-              <w:t xml:space="default">0.714</w:t>
+              <w:t xml:space="default">0.854</w:t>
             </w:r>
           </w:p>
         </w:tc>
@@ -3143,7 +3131,7 @@
                 <w:rFonts w:ascii="Calibri" w:hAnsi="Calibri"/>
                 <w:sz w:val="20"/>
               </w:rPr>
-              <w:t xml:space="default">0.909</w:t>
+              <w:t xml:space="default">0.854</w:t>
             </w:r>
           </w:p>
         </w:tc>
@@ -3576,7 +3564,6 @@
               <w:start w:val="single" w:space="0" w:color="D3D3D3"/>
               <w:end w:val="single" w:space="0" w:color="D3D3D3"/>
             </w:tcBorders>
-            <w:shd w:val="clear" w:color="auto" w:fill="E8F4E8"/>
           </w:tcPr>
           <w:p>
             <w:pPr>
@@ -3601,20 +3588,19 @@
               <w:start w:val="single" w:space="0" w:color="D3D3D3"/>
               <w:end w:val="single" w:space="0" w:color="D3D3D3"/>
             </w:tcBorders>
-            <w:shd w:val="clear" w:color="auto" w:fill="C8E6C9"/>
-          </w:tcPr>
-          <w:p>
-            <w:pPr>
-              <w:spacing w:before="0" w:after="60"/>
-              <w:keepNext/>
-              <w:jc w:val="center"/>
-            </w:pPr>
-            <w:r>
-              <w:rPr>
-                <w:rFonts w:ascii="Calibri" w:hAnsi="Calibri"/>
-                <w:sz w:val="20"/>
-              </w:rPr>
-              <w:t xml:space="default">&lt;0.001</w:t>
+          </w:tcPr>
+          <w:p>
+            <w:pPr>
+              <w:spacing w:before="0" w:after="60"/>
+              <w:keepNext/>
+              <w:jc w:val="center"/>
+            </w:pPr>
+            <w:r>
+              <w:rPr>
+                <w:rFonts w:ascii="Calibri" w:hAnsi="Calibri"/>
+                <w:sz w:val="20"/>
+              </w:rPr>
+              <w:t xml:space="default">—</w:t>
             </w:r>
           </w:p>
         </w:tc>
@@ -3799,7 +3785,6 @@
               <w:start w:val="single" w:space="0" w:color="D3D3D3"/>
               <w:end w:val="single" w:space="0" w:color="D3D3D3"/>
             </w:tcBorders>
-            <w:shd w:val="clear" w:color="auto" w:fill="E8F4E8"/>
           </w:tcPr>
           <w:p>
             <w:pPr>
@@ -3824,20 +3809,19 @@
               <w:start w:val="single" w:space="0" w:color="D3D3D3"/>
               <w:end w:val="single" w:space="0" w:color="D3D3D3"/>
             </w:tcBorders>
-            <w:shd w:val="clear" w:color="auto" w:fill="C8E6C9"/>
-          </w:tcPr>
-          <w:p>
-            <w:pPr>
-              <w:spacing w:before="0" w:after="60"/>
-              <w:keepNext/>
-              <w:jc w:val="center"/>
-            </w:pPr>
-            <w:r>
-              <w:rPr>
-                <w:rFonts w:ascii="Calibri" w:hAnsi="Calibri"/>
-                <w:sz w:val="20"/>
-              </w:rPr>
-              <w:t xml:space="default">0.016</w:t>
+          </w:tcPr>
+          <w:p>
+            <w:pPr>
+              <w:spacing w:before="0" w:after="60"/>
+              <w:keepNext/>
+              <w:jc w:val="center"/>
+            </w:pPr>
+            <w:r>
+              <w:rPr>
+                <w:rFonts w:ascii="Calibri" w:hAnsi="Calibri"/>
+                <w:sz w:val="20"/>
+              </w:rPr>
+              <w:t xml:space="default">—</w:t>
             </w:r>
           </w:p>
         </w:tc>
@@ -4058,7 +4042,7 @@
                 <w:rFonts w:ascii="Calibri" w:hAnsi="Calibri"/>
                 <w:sz w:val="20"/>
               </w:rPr>
-              <w:t xml:space="default">0.687</w:t>
+              <w:t xml:space="default">—</w:t>
             </w:r>
           </w:p>
         </w:tc>
@@ -4217,7 +4201,7 @@
                 <w:rFonts w:ascii="Calibri" w:hAnsi="Calibri"/>
                 <w:sz w:val="20"/>
               </w:rPr>
-              <w:t xml:space="default">0.772</w:t>
+              <w:t xml:space="default">0.620</w:t>
             </w:r>
           </w:p>
         </w:tc>
@@ -4313,7 +4297,7 @@
                 <w:rFonts w:ascii="Calibri" w:hAnsi="Calibri"/>
                 <w:sz w:val="20"/>
               </w:rPr>
-              <w:t xml:space="default">0.694</w:t>
+              <w:t xml:space="default">0.620</w:t>
             </w:r>
           </w:p>
         </w:tc>
@@ -4438,7 +4422,7 @@
                 <w:rFonts w:ascii="Calibri" w:hAnsi="Calibri"/>
                 <w:sz w:val="20"/>
               </w:rPr>
-              <w:t xml:space="default">0.159</w:t>
+              <w:t xml:space="default">0.565</w:t>
             </w:r>
           </w:p>
         </w:tc>
@@ -4498,7 +4482,6 @@
               <w:start w:val="single" w:space="0" w:color="D3D3D3"/>
               <w:end w:val="single" w:space="0" w:color="D3D3D3"/>
             </w:tcBorders>
-            <w:shd w:val="clear" w:color="auto" w:fill="E8F4E8"/>
           </w:tcPr>
           <w:p>
             <w:pPr>
@@ -4535,7 +4518,7 @@
                 <w:rFonts w:ascii="Calibri" w:hAnsi="Calibri"/>
                 <w:sz w:val="20"/>
               </w:rPr>
-              <w:t xml:space="default">0.104</w:t>
+              <w:t xml:space="default">0.348</w:t>
             </w:r>
           </w:p>
         </w:tc>
@@ -4624,7 +4607,6 @@
               <w:start w:val="single" w:space="0" w:color="D3D3D3"/>
               <w:end w:val="single" w:space="0" w:color="D3D3D3"/>
             </w:tcBorders>
-            <w:shd w:val="clear" w:color="auto" w:fill="E8F4E8"/>
           </w:tcPr>
           <w:p>
             <w:pPr>
@@ -4649,20 +4631,19 @@
               <w:start w:val="single" w:space="0" w:color="D3D3D3"/>
               <w:end w:val="single" w:space="0" w:color="D3D3D3"/>
             </w:tcBorders>
-            <w:shd w:val="clear" w:color="auto" w:fill="C8E6C9"/>
-          </w:tcPr>
-          <w:p>
-            <w:pPr>
-              <w:spacing w:before="0" w:after="60"/>
-              <w:keepNext/>
-              <w:jc w:val="center"/>
-            </w:pPr>
-            <w:r>
-              <w:rPr>
-                <w:rFonts w:ascii="Calibri" w:hAnsi="Calibri"/>
-                <w:sz w:val="20"/>
-              </w:rPr>
-              <w:t xml:space="default">0.028</w:t>
+          </w:tcPr>
+          <w:p>
+            <w:pPr>
+              <w:spacing w:before="0" w:after="60"/>
+              <w:keepNext/>
+              <w:jc w:val="center"/>
+            </w:pPr>
+            <w:r>
+              <w:rPr>
+                <w:rFonts w:ascii="Calibri" w:hAnsi="Calibri"/>
+                <w:sz w:val="20"/>
+              </w:rPr>
+              <w:t xml:space="default">0.081</w:t>
             </w:r>
           </w:p>
         </w:tc>
@@ -4758,7 +4739,7 @@
                 <w:rFonts w:ascii="Calibri" w:hAnsi="Calibri"/>
                 <w:sz w:val="20"/>
               </w:rPr>
-              <w:t xml:space="default">0.866</w:t>
+              <w:t xml:space="default">0.998</w:t>
             </w:r>
           </w:p>
         </w:tc>
@@ -4883,7 +4864,7 @@
                 <w:rFonts w:ascii="Calibri" w:hAnsi="Calibri"/>
                 <w:sz w:val="20"/>
               </w:rPr>
-              <w:t xml:space="default">0.297</w:t>
+              <w:t xml:space="default">0.854</w:t>
             </w:r>
           </w:p>
         </w:tc>
@@ -4979,7 +4960,7 @@
                 <w:rFonts w:ascii="Calibri" w:hAnsi="Calibri"/>
                 <w:sz w:val="20"/>
               </w:rPr>
-              <w:t xml:space="default">0.549</w:t>
+              <w:t xml:space="default">0.854</w:t>
             </w:r>
           </w:p>
         </w:tc>
@@ -5412,7 +5393,6 @@
               <w:start w:val="single" w:space="0" w:color="D3D3D3"/>
               <w:end w:val="single" w:space="0" w:color="D3D3D3"/>
             </w:tcBorders>
-            <w:shd w:val="clear" w:color="auto" w:fill="E8F4E8"/>
           </w:tcPr>
           <w:p>
             <w:pPr>
@@ -5437,20 +5417,19 @@
               <w:start w:val="single" w:space="0" w:color="D3D3D3"/>
               <w:end w:val="single" w:space="0" w:color="D3D3D3"/>
             </w:tcBorders>
-            <w:shd w:val="clear" w:color="auto" w:fill="C8E6C9"/>
-          </w:tcPr>
-          <w:p>
-            <w:pPr>
-              <w:spacing w:before="0" w:after="60"/>
-              <w:keepNext/>
-              <w:jc w:val="center"/>
-            </w:pPr>
-            <w:r>
-              <w:rPr>
-                <w:rFonts w:ascii="Calibri" w:hAnsi="Calibri"/>
-                <w:sz w:val="20"/>
-              </w:rPr>
-              <w:t xml:space="default">&lt;0.001</w:t>
+          </w:tcPr>
+          <w:p>
+            <w:pPr>
+              <w:spacing w:before="0" w:after="60"/>
+              <w:keepNext/>
+              <w:jc w:val="center"/>
+            </w:pPr>
+            <w:r>
+              <w:rPr>
+                <w:rFonts w:ascii="Calibri" w:hAnsi="Calibri"/>
+                <w:sz w:val="20"/>
+              </w:rPr>
+              <w:t xml:space="default">—</w:t>
             </w:r>
           </w:p>
         </w:tc>
@@ -5671,7 +5650,7 @@
                 <w:rFonts w:ascii="Calibri" w:hAnsi="Calibri"/>
                 <w:sz w:val="20"/>
               </w:rPr>
-              <w:t xml:space="default">0.159</w:t>
+              <w:t xml:space="default">—</w:t>
             </w:r>
           </w:p>
         </w:tc>
@@ -5892,7 +5871,7 @@
                 <w:rFonts w:ascii="Calibri" w:hAnsi="Calibri"/>
                 <w:sz w:val="20"/>
               </w:rPr>
-              <w:t xml:space="default">0.549</w:t>
+              <w:t xml:space="default">—</w:t>
             </w:r>
           </w:p>
         </w:tc>
@@ -5926,7 +5905,7 @@
                 <w:sz w:val="20"/>
                 <w:b w:val="true"/>
               </w:rPr>
-              <w:t xml:space="default">p-tau181 (log)</w:t>
+              <w:t xml:space="default">ptau181 (log)</w:t>
             </w:r>
           </w:p>
         </w:tc>
@@ -6015,7 +5994,6 @@
               <w:start w:val="single" w:space="0" w:color="D3D3D3"/>
               <w:end w:val="single" w:space="0" w:color="D3D3D3"/>
             </w:tcBorders>
-            <w:shd w:val="clear" w:color="auto" w:fill="E8F4E8"/>
           </w:tcPr>
           <w:p>
             <w:pPr>
@@ -6040,20 +6018,19 @@
               <w:start w:val="single" w:space="0" w:color="D3D3D3"/>
               <w:end w:val="single" w:space="0" w:color="D3D3D3"/>
             </w:tcBorders>
-            <w:shd w:val="clear" w:color="auto" w:fill="C8E6C9"/>
-          </w:tcPr>
-          <w:p>
-            <w:pPr>
-              <w:spacing w:before="0" w:after="60"/>
-              <w:keepNext/>
-              <w:jc w:val="center"/>
-            </w:pPr>
-            <w:r>
-              <w:rPr>
-                <w:rFonts w:ascii="Calibri" w:hAnsi="Calibri"/>
-                <w:sz w:val="20"/>
-              </w:rPr>
-              <w:t xml:space="default">0.021</w:t>
+          </w:tcPr>
+          <w:p>
+            <w:pPr>
+              <w:spacing w:before="0" w:after="60"/>
+              <w:keepNext/>
+              <w:jc w:val="center"/>
+            </w:pPr>
+            <w:r>
+              <w:rPr>
+                <w:rFonts w:ascii="Calibri" w:hAnsi="Calibri"/>
+                <w:sz w:val="20"/>
+              </w:rPr>
+              <w:t xml:space="default">0.019 *</w:t>
             </w:r>
           </w:p>
         </w:tc>
@@ -6113,7 +6090,6 @@
               <w:start w:val="single" w:space="0" w:color="D3D3D3"/>
               <w:end w:val="single" w:space="0" w:color="D3D3D3"/>
             </w:tcBorders>
-            <w:shd w:val="clear" w:color="auto" w:fill="E8F4E8"/>
           </w:tcPr>
           <w:p>
             <w:pPr>
@@ -6138,20 +6114,19 @@
               <w:start w:val="single" w:space="0" w:color="D3D3D3"/>
               <w:end w:val="single" w:space="0" w:color="D3D3D3"/>
             </w:tcBorders>
-            <w:shd w:val="clear" w:color="auto" w:fill="C8E6C9"/>
-          </w:tcPr>
-          <w:p>
-            <w:pPr>
-              <w:spacing w:before="0" w:after="60"/>
-              <w:keepNext/>
-              <w:jc w:val="center"/>
-            </w:pPr>
-            <w:r>
-              <w:rPr>
-                <w:rFonts w:ascii="Calibri" w:hAnsi="Calibri"/>
-                <w:sz w:val="20"/>
-              </w:rPr>
-              <w:t xml:space="default">0.006</w:t>
+          </w:tcPr>
+          <w:p>
+            <w:pPr>
+              <w:spacing w:before="0" w:after="60"/>
+              <w:keepNext/>
+              <w:jc w:val="center"/>
+            </w:pPr>
+            <w:r>
+              <w:rPr>
+                <w:rFonts w:ascii="Calibri" w:hAnsi="Calibri"/>
+                <w:sz w:val="20"/>
+              </w:rPr>
+              <w:t xml:space="default">0.007 **</w:t>
             </w:r>
           </w:p>
         </w:tc>
@@ -6276,7 +6251,7 @@
                 <w:rFonts w:ascii="Calibri" w:hAnsi="Calibri"/>
                 <w:sz w:val="20"/>
               </w:rPr>
-              <w:t xml:space="default">0.868</w:t>
+              <w:t xml:space="default">0.957</w:t>
             </w:r>
           </w:p>
         </w:tc>
@@ -6372,7 +6347,7 @@
                 <w:rFonts w:ascii="Calibri" w:hAnsi="Calibri"/>
                 <w:sz w:val="20"/>
               </w:rPr>
-              <w:t xml:space="default">0.824</w:t>
+              <w:t xml:space="default">0.957</w:t>
             </w:r>
           </w:p>
         </w:tc>
@@ -6497,7 +6472,7 @@
                 <w:rFonts w:ascii="Calibri" w:hAnsi="Calibri"/>
                 <w:sz w:val="20"/>
               </w:rPr>
-              <w:t xml:space="default">0.224</w:t>
+              <w:t xml:space="default">0.948</w:t>
             </w:r>
           </w:p>
         </w:tc>
@@ -6593,7 +6568,7 @@
                 <w:rFonts w:ascii="Calibri" w:hAnsi="Calibri"/>
                 <w:sz w:val="20"/>
               </w:rPr>
-              <w:t xml:space="default">0.868</w:t>
+              <w:t xml:space="default">0.998</w:t>
             </w:r>
           </w:p>
         </w:tc>
@@ -6718,7 +6693,7 @@
                 <w:rFonts w:ascii="Calibri" w:hAnsi="Calibri"/>
                 <w:sz w:val="20"/>
               </w:rPr>
-              <w:t xml:space="default">0.549</w:t>
+              <w:t xml:space="default">0.854</w:t>
             </w:r>
           </w:p>
         </w:tc>
@@ -6814,7 +6789,7 @@
                 <w:rFonts w:ascii="Calibri" w:hAnsi="Calibri"/>
                 <w:sz w:val="20"/>
               </w:rPr>
-              <w:t xml:space="default">0.714</w:t>
+              <w:t xml:space="default">0.854</w:t>
             </w:r>
           </w:p>
         </w:tc>
@@ -7247,7 +7222,6 @@
               <w:start w:val="single" w:space="0" w:color="D3D3D3"/>
               <w:end w:val="single" w:space="0" w:color="D3D3D3"/>
             </w:tcBorders>
-            <w:shd w:val="clear" w:color="auto" w:fill="E8F4E8"/>
           </w:tcPr>
           <w:p>
             <w:pPr>
@@ -7272,20 +7246,19 @@
               <w:start w:val="single" w:space="0" w:color="D3D3D3"/>
               <w:end w:val="single" w:space="0" w:color="D3D3D3"/>
             </w:tcBorders>
-            <w:shd w:val="clear" w:color="auto" w:fill="C8E6C9"/>
-          </w:tcPr>
-          <w:p>
-            <w:pPr>
-              <w:spacing w:before="0" w:after="60"/>
-              <w:keepNext/>
-              <w:jc w:val="center"/>
-            </w:pPr>
-            <w:r>
-              <w:rPr>
-                <w:rFonts w:ascii="Calibri" w:hAnsi="Calibri"/>
-                <w:sz w:val="20"/>
-              </w:rPr>
-              <w:t xml:space="default">&lt;0.001</w:t>
+          </w:tcPr>
+          <w:p>
+            <w:pPr>
+              <w:spacing w:before="0" w:after="60"/>
+              <w:keepNext/>
+              <w:jc w:val="center"/>
+            </w:pPr>
+            <w:r>
+              <w:rPr>
+                <w:rFonts w:ascii="Calibri" w:hAnsi="Calibri"/>
+                <w:sz w:val="20"/>
+              </w:rPr>
+              <w:t xml:space="default">—</w:t>
             </w:r>
           </w:p>
         </w:tc>
@@ -7506,7 +7479,7 @@
                 <w:rFonts w:ascii="Calibri" w:hAnsi="Calibri"/>
                 <w:sz w:val="20"/>
               </w:rPr>
-              <w:t xml:space="default">0.590</w:t>
+              <w:t xml:space="default">—</w:t>
             </w:r>
           </w:p>
         </w:tc>
@@ -7727,7 +7700,7 @@
                 <w:rFonts w:ascii="Calibri" w:hAnsi="Calibri"/>
                 <w:sz w:val="20"/>
               </w:rPr>
-              <w:t xml:space="default">0.868</w:t>
+              <w:t xml:space="default">—</w:t>
             </w:r>
           </w:p>
         </w:tc>
@@ -7761,7 +7734,7 @@
                 <w:sz w:val="20"/>
                 <w:b w:val="true"/>
               </w:rPr>
-              <w:t xml:space="default">p-tau217 (log)</w:t>
+              <w:t xml:space="default">ptau217 (log)</w:t>
             </w:r>
           </w:p>
         </w:tc>
@@ -7850,7 +7823,6 @@
               <w:start w:val="single" w:space="0" w:color="D3D3D3"/>
               <w:end w:val="single" w:space="0" w:color="D3D3D3"/>
             </w:tcBorders>
-            <w:shd w:val="clear" w:color="auto" w:fill="E8F4E8"/>
           </w:tcPr>
           <w:p>
             <w:pPr>
@@ -7875,7 +7847,78 @@
               <w:start w:val="single" w:space="0" w:color="D3D3D3"/>
               <w:end w:val="single" w:space="0" w:color="D3D3D3"/>
             </w:tcBorders>
-            <w:shd w:val="clear" w:color="auto" w:fill="C8E6C9"/>
+          </w:tcPr>
+          <w:p>
+            <w:pPr>
+              <w:spacing w:before="0" w:after="60"/>
+              <w:keepNext/>
+              <w:jc w:val="center"/>
+            </w:pPr>
+            <w:r>
+              <w:rPr>
+                <w:rFonts w:ascii="Calibri" w:hAnsi="Calibri"/>
+                <w:sz w:val="20"/>
+              </w:rPr>
+              <w:t xml:space="default">&lt;0.001 ***</w:t>
+            </w:r>
+          </w:p>
+        </w:tc>
+        <w:tc>
+          <w:tcPr>
+            <w:tcBorders>
+              <w:top w:val="single" w:space="0" w:color="D3D3D3"/>
+              <w:bottom w:val="single" w:space="0" w:color="D3D3D3"/>
+              <w:start w:val="single" w:space="0" w:color="D3D3D3"/>
+              <w:end w:val="single" w:space="0" w:color="D3D3D3"/>
+            </w:tcBorders>
+          </w:tcPr>
+          <w:p>
+            <w:pPr>
+              <w:spacing w:before="0" w:after="60"/>
+              <w:keepNext/>
+              <w:jc w:val="center"/>
+            </w:pPr>
+            <w:r>
+              <w:rPr>
+                <w:rFonts w:ascii="Calibri" w:hAnsi="Calibri"/>
+                <w:sz w:val="20"/>
+              </w:rPr>
+              <w:t xml:space="default">0.327 (0.059)</w:t>
+            </w:r>
+          </w:p>
+        </w:tc>
+        <w:tc>
+          <w:tcPr>
+            <w:tcBorders>
+              <w:top w:val="single" w:space="0" w:color="D3D3D3"/>
+              <w:bottom w:val="single" w:space="0" w:color="D3D3D3"/>
+              <w:start w:val="single" w:space="0" w:color="D3D3D3"/>
+              <w:end w:val="single" w:space="0" w:color="D3D3D3"/>
+            </w:tcBorders>
+          </w:tcPr>
+          <w:p>
+            <w:pPr>
+              <w:spacing w:before="0" w:after="60"/>
+              <w:keepNext/>
+              <w:jc w:val="center"/>
+            </w:pPr>
+            <w:r>
+              <w:rPr>
+                <w:rFonts w:ascii="Calibri" w:hAnsi="Calibri"/>
+                <w:sz w:val="20"/>
+              </w:rPr>
+              <w:t xml:space="default">[0.210, 0.443]</w:t>
+            </w:r>
+          </w:p>
+        </w:tc>
+        <w:tc>
+          <w:tcPr>
+            <w:tcBorders>
+              <w:top w:val="single" w:space="0" w:color="D3D3D3"/>
+              <w:bottom w:val="single" w:space="0" w:color="D3D3D3"/>
+              <w:start w:val="single" w:space="0" w:color="D3D3D3"/>
+              <w:end w:val="single" w:space="0" w:color="D3D3D3"/>
+            </w:tcBorders>
           </w:tcPr>
           <w:p>
             <w:pPr>
@@ -7912,81 +7955,7 @@
                 <w:rFonts w:ascii="Calibri" w:hAnsi="Calibri"/>
                 <w:sz w:val="20"/>
               </w:rPr>
-              <w:t xml:space="default">0.327 (0.059)</w:t>
-            </w:r>
-          </w:p>
-        </w:tc>
-        <w:tc>
-          <w:tcPr>
-            <w:tcBorders>
-              <w:top w:val="single" w:space="0" w:color="D3D3D3"/>
-              <w:bottom w:val="single" w:space="0" w:color="D3D3D3"/>
-              <w:start w:val="single" w:space="0" w:color="D3D3D3"/>
-              <w:end w:val="single" w:space="0" w:color="D3D3D3"/>
-            </w:tcBorders>
-          </w:tcPr>
-          <w:p>
-            <w:pPr>
-              <w:spacing w:before="0" w:after="60"/>
-              <w:keepNext/>
-              <w:jc w:val="center"/>
-            </w:pPr>
-            <w:r>
-              <w:rPr>
-                <w:rFonts w:ascii="Calibri" w:hAnsi="Calibri"/>
-                <w:sz w:val="20"/>
-              </w:rPr>
-              <w:t xml:space="default">[0.210, 0.443]</w:t>
-            </w:r>
-          </w:p>
-        </w:tc>
-        <w:tc>
-          <w:tcPr>
-            <w:tcBorders>
-              <w:top w:val="single" w:space="0" w:color="D3D3D3"/>
-              <w:bottom w:val="single" w:space="0" w:color="D3D3D3"/>
-              <w:start w:val="single" w:space="0" w:color="D3D3D3"/>
-              <w:end w:val="single" w:space="0" w:color="D3D3D3"/>
-            </w:tcBorders>
-            <w:shd w:val="clear" w:color="auto" w:fill="E8F4E8"/>
-          </w:tcPr>
-          <w:p>
-            <w:pPr>
-              <w:spacing w:before="0" w:after="60"/>
-              <w:keepNext/>
-              <w:jc w:val="center"/>
-            </w:pPr>
-            <w:r>
-              <w:rPr>
-                <w:rFonts w:ascii="Calibri" w:hAnsi="Calibri"/>
-                <w:sz w:val="20"/>
-              </w:rPr>
-              <w:t xml:space="default">&lt;0.001</w:t>
-            </w:r>
-          </w:p>
-        </w:tc>
-        <w:tc>
-          <w:tcPr>
-            <w:tcBorders>
-              <w:top w:val="single" w:space="0" w:color="D3D3D3"/>
-              <w:bottom w:val="single" w:space="0" w:color="D3D3D3"/>
-              <w:start w:val="single" w:space="0" w:color="D3D3D3"/>
-              <w:end w:val="single" w:space="0" w:color="D3D3D3"/>
-            </w:tcBorders>
-            <w:shd w:val="clear" w:color="auto" w:fill="C8E6C9"/>
-          </w:tcPr>
-          <w:p>
-            <w:pPr>
-              <w:spacing w:before="0" w:after="60"/>
-              <w:keepNext/>
-              <w:jc w:val="center"/>
-            </w:pPr>
-            <w:r>
-              <w:rPr>
-                <w:rFonts w:ascii="Calibri" w:hAnsi="Calibri"/>
-                <w:sz w:val="20"/>
-              </w:rPr>
-              <w:t xml:space="default">&lt;0.001</w:t>
+              <w:t xml:space="default">&lt;0.001 ***</w:t>
             </w:r>
           </w:p>
         </w:tc>
@@ -8111,7 +8080,7 @@
                 <w:rFonts w:ascii="Calibri" w:hAnsi="Calibri"/>
                 <w:sz w:val="20"/>
               </w:rPr>
-              <w:t xml:space="default">0.868</w:t>
+              <w:t xml:space="default">0.957</w:t>
             </w:r>
           </w:p>
         </w:tc>
@@ -8207,7 +8176,7 @@
                 <w:rFonts w:ascii="Calibri" w:hAnsi="Calibri"/>
                 <w:sz w:val="20"/>
               </w:rPr>
-              <w:t xml:space="default">0.967</w:t>
+              <w:t xml:space="default">0.957</w:t>
             </w:r>
           </w:p>
         </w:tc>
@@ -8296,7 +8265,6 @@
               <w:start w:val="single" w:space="0" w:color="D3D3D3"/>
               <w:end w:val="single" w:space="0" w:color="D3D3D3"/>
             </w:tcBorders>
-            <w:shd w:val="clear" w:color="auto" w:fill="E8F4E8"/>
           </w:tcPr>
           <w:p>
             <w:pPr>
@@ -8321,20 +8289,19 @@
               <w:start w:val="single" w:space="0" w:color="D3D3D3"/>
               <w:end w:val="single" w:space="0" w:color="D3D3D3"/>
             </w:tcBorders>
-            <w:shd w:val="clear" w:color="auto" w:fill="C8E6C9"/>
-          </w:tcPr>
-          <w:p>
-            <w:pPr>
-              <w:spacing w:before="0" w:after="60"/>
-              <w:keepNext/>
-              <w:jc w:val="center"/>
-            </w:pPr>
-            <w:r>
-              <w:rPr>
-                <w:rFonts w:ascii="Calibri" w:hAnsi="Calibri"/>
-                <w:sz w:val="20"/>
-              </w:rPr>
-              <w:t xml:space="default">0.021</w:t>
+          </w:tcPr>
+          <w:p>
+            <w:pPr>
+              <w:spacing w:before="0" w:after="60"/>
+              <w:keepNext/>
+              <w:jc w:val="center"/>
+            </w:pPr>
+            <w:r>
+              <w:rPr>
+                <w:rFonts w:ascii="Calibri" w:hAnsi="Calibri"/>
+                <w:sz w:val="20"/>
+              </w:rPr>
+              <w:t xml:space="default">0.053</w:t>
             </w:r>
           </w:p>
         </w:tc>
@@ -8430,7 +8397,7 @@
                 <w:rFonts w:ascii="Calibri" w:hAnsi="Calibri"/>
                 <w:sz w:val="20"/>
               </w:rPr>
-              <w:t xml:space="default">0.590</w:t>
+              <w:t xml:space="default">0.998</w:t>
             </w:r>
           </w:p>
         </w:tc>
@@ -8555,7 +8522,7 @@
                 <w:rFonts w:ascii="Calibri" w:hAnsi="Calibri"/>
                 <w:sz w:val="20"/>
               </w:rPr>
-              <w:t xml:space="default">0.224</w:t>
+              <w:t xml:space="default">0.854</w:t>
             </w:r>
           </w:p>
         </w:tc>
@@ -8651,7 +8618,7 @@
                 <w:rFonts w:ascii="Calibri" w:hAnsi="Calibri"/>
                 <w:sz w:val="20"/>
               </w:rPr>
-              <w:t xml:space="default">0.297</w:t>
+              <w:t xml:space="default">0.854</w:t>
             </w:r>
           </w:p>
         </w:tc>
@@ -9084,7 +9051,6 @@
               <w:start w:val="single" w:space="0" w:color="D3D3D3"/>
               <w:end w:val="single" w:space="0" w:color="D3D3D3"/>
             </w:tcBorders>
-            <w:shd w:val="clear" w:color="auto" w:fill="E8F4E8"/>
           </w:tcPr>
           <w:p>
             <w:pPr>
@@ -9109,20 +9075,19 @@
               <w:start w:val="single" w:space="0" w:color="D3D3D3"/>
               <w:end w:val="single" w:space="0" w:color="D3D3D3"/>
             </w:tcBorders>
-            <w:shd w:val="clear" w:color="auto" w:fill="C8E6C9"/>
-          </w:tcPr>
-          <w:p>
-            <w:pPr>
-              <w:spacing w:before="0" w:after="60"/>
-              <w:keepNext/>
-              <w:jc w:val="center"/>
-            </w:pPr>
-            <w:r>
-              <w:rPr>
-                <w:rFonts w:ascii="Calibri" w:hAnsi="Calibri"/>
-                <w:sz w:val="20"/>
-              </w:rPr>
-              <w:t xml:space="default">&lt;0.001</w:t>
+          </w:tcPr>
+          <w:p>
+            <w:pPr>
+              <w:spacing w:before="0" w:after="60"/>
+              <w:keepNext/>
+              <w:jc w:val="center"/>
+            </w:pPr>
+            <w:r>
+              <w:rPr>
+                <w:rFonts w:ascii="Calibri" w:hAnsi="Calibri"/>
+                <w:sz w:val="20"/>
+              </w:rPr>
+              <w:t xml:space="default">—</w:t>
             </w:r>
           </w:p>
         </w:tc>
@@ -9343,7 +9308,7 @@
                 <w:rFonts w:ascii="Calibri" w:hAnsi="Calibri"/>
                 <w:sz w:val="20"/>
               </w:rPr>
-              <w:t xml:space="default">0.549</w:t>
+              <w:t xml:space="default">—</w:t>
             </w:r>
           </w:p>
         </w:tc>
@@ -9564,7 +9529,7 @@
                 <w:rFonts w:ascii="Calibri" w:hAnsi="Calibri"/>
                 <w:sz w:val="20"/>
               </w:rPr>
-              <w:t xml:space="default">0.858</w:t>
+              <w:t xml:space="default">—</w:t>
             </w:r>
           </w:p>
         </w:tc>
@@ -9598,7 +9563,7 @@
                 <w:sz w:val="20"/>
                 <w:b w:val="true"/>
               </w:rPr>
-              <w:t xml:space="default">p-tau217/Aβ42 ratio (log)</w:t>
+              <w:t xml:space="default">ptau217/Aβ42 ratio (log)</w:t>
             </w:r>
           </w:p>
         </w:tc>
@@ -9687,7 +9652,6 @@
               <w:start w:val="single" w:space="0" w:color="D3D3D3"/>
               <w:end w:val="single" w:space="0" w:color="D3D3D3"/>
             </w:tcBorders>
-            <w:shd w:val="clear" w:color="auto" w:fill="E8F4E8"/>
           </w:tcPr>
           <w:p>
             <w:pPr>
@@ -9712,7 +9676,78 @@
               <w:start w:val="single" w:space="0" w:color="D3D3D3"/>
               <w:end w:val="single" w:space="0" w:color="D3D3D3"/>
             </w:tcBorders>
-            <w:shd w:val="clear" w:color="auto" w:fill="C8E6C9"/>
+          </w:tcPr>
+          <w:p>
+            <w:pPr>
+              <w:spacing w:before="0" w:after="60"/>
+              <w:keepNext/>
+              <w:jc w:val="center"/>
+            </w:pPr>
+            <w:r>
+              <w:rPr>
+                <w:rFonts w:ascii="Calibri" w:hAnsi="Calibri"/>
+                <w:sz w:val="20"/>
+              </w:rPr>
+              <w:t xml:space="default">&lt;0.001 ***</w:t>
+            </w:r>
+          </w:p>
+        </w:tc>
+        <w:tc>
+          <w:tcPr>
+            <w:tcBorders>
+              <w:top w:val="single" w:space="0" w:color="D3D3D3"/>
+              <w:bottom w:val="single" w:space="0" w:color="D3D3D3"/>
+              <w:start w:val="single" w:space="0" w:color="D3D3D3"/>
+              <w:end w:val="single" w:space="0" w:color="D3D3D3"/>
+            </w:tcBorders>
+          </w:tcPr>
+          <w:p>
+            <w:pPr>
+              <w:spacing w:before="0" w:after="60"/>
+              <w:keepNext/>
+              <w:jc w:val="center"/>
+            </w:pPr>
+            <w:r>
+              <w:rPr>
+                <w:rFonts w:ascii="Calibri" w:hAnsi="Calibri"/>
+                <w:sz w:val="20"/>
+              </w:rPr>
+              <w:t xml:space="default">0.360 (0.068)</w:t>
+            </w:r>
+          </w:p>
+        </w:tc>
+        <w:tc>
+          <w:tcPr>
+            <w:tcBorders>
+              <w:top w:val="single" w:space="0" w:color="D3D3D3"/>
+              <w:bottom w:val="single" w:space="0" w:color="D3D3D3"/>
+              <w:start w:val="single" w:space="0" w:color="D3D3D3"/>
+              <w:end w:val="single" w:space="0" w:color="D3D3D3"/>
+            </w:tcBorders>
+          </w:tcPr>
+          <w:p>
+            <w:pPr>
+              <w:spacing w:before="0" w:after="60"/>
+              <w:keepNext/>
+              <w:jc w:val="center"/>
+            </w:pPr>
+            <w:r>
+              <w:rPr>
+                <w:rFonts w:ascii="Calibri" w:hAnsi="Calibri"/>
+                <w:sz w:val="20"/>
+              </w:rPr>
+              <w:t xml:space="default">[0.226, 0.494]</w:t>
+            </w:r>
+          </w:p>
+        </w:tc>
+        <w:tc>
+          <w:tcPr>
+            <w:tcBorders>
+              <w:top w:val="single" w:space="0" w:color="D3D3D3"/>
+              <w:bottom w:val="single" w:space="0" w:color="D3D3D3"/>
+              <w:start w:val="single" w:space="0" w:color="D3D3D3"/>
+              <w:end w:val="single" w:space="0" w:color="D3D3D3"/>
+            </w:tcBorders>
           </w:tcPr>
           <w:p>
             <w:pPr>
@@ -9749,81 +9784,7 @@
                 <w:rFonts w:ascii="Calibri" w:hAnsi="Calibri"/>
                 <w:sz w:val="20"/>
               </w:rPr>
-              <w:t xml:space="default">0.360 (0.068)</w:t>
-            </w:r>
-          </w:p>
-        </w:tc>
-        <w:tc>
-          <w:tcPr>
-            <w:tcBorders>
-              <w:top w:val="single" w:space="0" w:color="D3D3D3"/>
-              <w:bottom w:val="single" w:space="0" w:color="D3D3D3"/>
-              <w:start w:val="single" w:space="0" w:color="D3D3D3"/>
-              <w:end w:val="single" w:space="0" w:color="D3D3D3"/>
-            </w:tcBorders>
-          </w:tcPr>
-          <w:p>
-            <w:pPr>
-              <w:spacing w:before="0" w:after="60"/>
-              <w:keepNext/>
-              <w:jc w:val="center"/>
-            </w:pPr>
-            <w:r>
-              <w:rPr>
-                <w:rFonts w:ascii="Calibri" w:hAnsi="Calibri"/>
-                <w:sz w:val="20"/>
-              </w:rPr>
-              <w:t xml:space="default">[0.226, 0.494]</w:t>
-            </w:r>
-          </w:p>
-        </w:tc>
-        <w:tc>
-          <w:tcPr>
-            <w:tcBorders>
-              <w:top w:val="single" w:space="0" w:color="D3D3D3"/>
-              <w:bottom w:val="single" w:space="0" w:color="D3D3D3"/>
-              <w:start w:val="single" w:space="0" w:color="D3D3D3"/>
-              <w:end w:val="single" w:space="0" w:color="D3D3D3"/>
-            </w:tcBorders>
-            <w:shd w:val="clear" w:color="auto" w:fill="E8F4E8"/>
-          </w:tcPr>
-          <w:p>
-            <w:pPr>
-              <w:spacing w:before="0" w:after="60"/>
-              <w:keepNext/>
-              <w:jc w:val="center"/>
-            </w:pPr>
-            <w:r>
-              <w:rPr>
-                <w:rFonts w:ascii="Calibri" w:hAnsi="Calibri"/>
-                <w:sz w:val="20"/>
-              </w:rPr>
-              <w:t xml:space="default">&lt;0.001</w:t>
-            </w:r>
-          </w:p>
-        </w:tc>
-        <w:tc>
-          <w:tcPr>
-            <w:tcBorders>
-              <w:top w:val="single" w:space="0" w:color="D3D3D3"/>
-              <w:bottom w:val="single" w:space="0" w:color="D3D3D3"/>
-              <w:start w:val="single" w:space="0" w:color="D3D3D3"/>
-              <w:end w:val="single" w:space="0" w:color="D3D3D3"/>
-            </w:tcBorders>
-            <w:shd w:val="clear" w:color="auto" w:fill="C8E6C9"/>
-          </w:tcPr>
-          <w:p>
-            <w:pPr>
-              <w:spacing w:before="0" w:after="60"/>
-              <w:keepNext/>
-              <w:jc w:val="center"/>
-            </w:pPr>
-            <w:r>
-              <w:rPr>
-                <w:rFonts w:ascii="Calibri" w:hAnsi="Calibri"/>
-                <w:sz w:val="20"/>
-              </w:rPr>
-              <w:t xml:space="default">&lt;0.001</w:t>
+              <w:t xml:space="default">&lt;0.001 ***</w:t>
             </w:r>
           </w:p>
         </w:tc>
@@ -9948,7 +9909,7 @@
                 <w:rFonts w:ascii="Calibri" w:hAnsi="Calibri"/>
                 <w:sz w:val="20"/>
               </w:rPr>
-              <w:t xml:space="default">0.738</w:t>
+              <w:t xml:space="default">0.957</w:t>
             </w:r>
           </w:p>
         </w:tc>
@@ -10044,7 +10005,7 @@
                 <w:rFonts w:ascii="Calibri" w:hAnsi="Calibri"/>
                 <w:sz w:val="20"/>
               </w:rPr>
-              <w:t xml:space="default">0.807</w:t>
+              <w:t xml:space="default">0.957</w:t>
             </w:r>
           </w:p>
         </w:tc>
@@ -10169,7 +10130,7 @@
                 <w:rFonts w:ascii="Calibri" w:hAnsi="Calibri"/>
                 <w:sz w:val="20"/>
               </w:rPr>
-              <w:t xml:space="default">0.315</w:t>
+              <w:t xml:space="default">0.998</w:t>
             </w:r>
           </w:p>
         </w:tc>
@@ -10390,7 +10351,7 @@
                 <w:rFonts w:ascii="Calibri" w:hAnsi="Calibri"/>
                 <w:sz w:val="20"/>
               </w:rPr>
-              <w:t xml:space="default">0.143</w:t>
+              <w:t xml:space="default">0.626</w:t>
             </w:r>
           </w:p>
         </w:tc>
@@ -10486,7 +10447,7 @@
                 <w:rFonts w:ascii="Calibri" w:hAnsi="Calibri"/>
                 <w:sz w:val="20"/>
               </w:rPr>
-              <w:t xml:space="default">0.224</w:t>
+              <w:t xml:space="default">0.854</w:t>
             </w:r>
           </w:p>
         </w:tc>
@@ -10919,7 +10880,6 @@
               <w:start w:val="single" w:space="0" w:color="D3D3D3"/>
               <w:end w:val="single" w:space="0" w:color="D3D3D3"/>
             </w:tcBorders>
-            <w:shd w:val="clear" w:color="auto" w:fill="E8F4E8"/>
           </w:tcPr>
           <w:p>
             <w:pPr>
@@ -10944,20 +10904,19 @@
               <w:start w:val="single" w:space="0" w:color="D3D3D3"/>
               <w:end w:val="single" w:space="0" w:color="D3D3D3"/>
             </w:tcBorders>
-            <w:shd w:val="clear" w:color="auto" w:fill="C8E6C9"/>
-          </w:tcPr>
-          <w:p>
-            <w:pPr>
-              <w:spacing w:before="0" w:after="60"/>
-              <w:keepNext/>
-              <w:jc w:val="center"/>
-            </w:pPr>
-            <w:r>
-              <w:rPr>
-                <w:rFonts w:ascii="Calibri" w:hAnsi="Calibri"/>
-                <w:sz w:val="20"/>
-              </w:rPr>
-              <w:t xml:space="default">0.022</w:t>
+          </w:tcPr>
+          <w:p>
+            <w:pPr>
+              <w:spacing w:before="0" w:after="60"/>
+              <w:keepNext/>
+              <w:jc w:val="center"/>
+            </w:pPr>
+            <w:r>
+              <w:rPr>
+                <w:rFonts w:ascii="Calibri" w:hAnsi="Calibri"/>
+                <w:sz w:val="20"/>
+              </w:rPr>
+              <w:t xml:space="default">—</w:t>
             </w:r>
           </w:p>
         </w:tc>
@@ -11178,7 +11137,7 @@
                 <w:rFonts w:ascii="Calibri" w:hAnsi="Calibri"/>
                 <w:sz w:val="20"/>
               </w:rPr>
-              <w:t xml:space="default">0.174</w:t>
+              <w:t xml:space="default">—</w:t>
             </w:r>
           </w:p>
         </w:tc>
@@ -11399,7 +11358,7 @@
                 <w:rFonts w:ascii="Calibri" w:hAnsi="Calibri"/>
                 <w:sz w:val="20"/>
               </w:rPr>
-              <w:t xml:space="default">0.714</w:t>
+              <w:t xml:space="default">—</w:t>
             </w:r>
           </w:p>
         </w:tc>
@@ -11431,7 +11390,7 @@
                 <w:rFonts w:ascii="Calibri" w:hAnsi="Calibri"/>
                 <w:sz w:val="20"/>
               </w:rPr>
-              <w:t xml:space="default">p: unadjusted; p (FDR): Benjamini-Hochberg FDR-adjusted. CogDrisk model: biomarker ~ APOE ε4 + CogDrisk score (z) + genetic risk score + family history. LIBRA2 model: same risk predictors using LIBRA2 score (z), additionally adjusted for age, sex, and education. Light green: p&lt;0.05; dark green: p(FDR)&lt;0.05. — = not applicable.</w:t>
+              <w:t xml:space="default">p: unadjusted; p.adj: Hochberg-adjusted within each predictor family (APOE, PRS, PXS, FHx; 12 tests per family: 6 biomarkers × 2 models). Stars denote adjusted p: *&lt;0.05, **&lt;0.01, ***&lt;0.001. — = not applicable. CogDrisk model: biomarker ~ APOE ε4 + CogDrisk score (z) + PRS + FHx. LIBRA2 model: same risk predictors using LIBRA2 score (z), additionally adjusted for age, sex, and education. Abbreviations: PRS=polygenic risk score, PXS=polyexposure risk score, FHx=family history.</w:t>
             </w:r>
           </w:p>
         </w:tc>

</xml_diff>